<commit_message>
Add visual architecture and polish submission presentation
</commit_message>
<xml_diff>
--- a/submission/NestProof_Track_C_Submission.docx
+++ b/submission/NestProof_Track_C_Submission.docx
@@ -540,6 +540,142 @@
         <w:t>Proposed WealthNest integration: place this review step before canonical holdings updates. Accepted facts and provenance could later support WealthGPT; no chatbot or live WealthNest integration is claimed in this prototype.</w:t>
       </w:r>
     </w:p>
+    <w:p>
+      <w:r>
+        <w:br w:type="page"/>
+      </w:r>
+    </w:p>
+    <w:p>
+      <w:pPr>
+        <w:pStyle w:val="Heading1"/>
+      </w:pPr>
+      <w:r>
+        <w:t>Architecture and reliability</w:t>
+      </w:r>
+    </w:p>
+    <w:p>
+      <w:r>
+        <w:t>The implemented flow separates interpretation from the authority to change accepted holdings. Uncertain evidence returns to human review; supported decisions still require a revision-bound preview and confirmation.</w:t>
+      </w:r>
+    </w:p>
+    <w:p>
+      <w:r>
+        <w:drawing>
+          <wp:inline xmlns:a="http://schemas.openxmlformats.org/drawingml/2006/main" xmlns:pic="http://schemas.openxmlformats.org/drawingml/2006/picture">
+            <wp:extent cx="6126480" cy="4594860"/>
+            <wp:docPr id="1" name="Picture 1" descr="NestProof system architecture"/>
+            <wp:cNvGraphicFramePr>
+              <a:graphicFrameLocks noChangeAspect="1"/>
+            </wp:cNvGraphicFramePr>
+            <a:graphic>
+              <a:graphicData uri="http://schemas.openxmlformats.org/drawingml/2006/picture">
+                <pic:pic>
+                  <pic:nvPicPr>
+                    <pic:cNvPr id="0" name="ARCHITECTURE.png"/>
+                    <pic:cNvPicPr/>
+                  </pic:nvPicPr>
+                  <pic:blipFill>
+                    <a:blip r:embed="rId12"/>
+                    <a:stretch>
+                      <a:fillRect/>
+                    </a:stretch>
+                  </pic:blipFill>
+                  <pic:spPr>
+                    <a:xfrm>
+                      <a:off x="0" y="0"/>
+                      <a:ext cx="6126480" cy="4594860"/>
+                    </a:xfrm>
+                    <a:prstGeom prst="rect"/>
+                  </pic:spPr>
+                </pic:pic>
+              </a:graphicData>
+            </a:graphic>
+          </wp:inline>
+        </w:drawing>
+      </w:r>
+    </w:p>
+    <w:p>
+      <w:pPr>
+        <w:pStyle w:val="Heading2"/>
+      </w:pPr>
+      <w:r>
+        <w:t>Implementation map</w:t>
+      </w:r>
+    </w:p>
+    <w:p>
+      <w:r>
+        <w:t>nestproof/engine.py — extraction, label classification, normalization, relation checks and clarification selection.</w:t>
+      </w:r>
+    </w:p>
+    <w:p>
+      <w:r>
+        <w:t>nestproof/app.py — API, permission checks, preview tokens, transactions, ledger revisions, receipts and undo.</w:t>
+      </w:r>
+    </w:p>
+    <w:p>
+      <w:r>
+        <w:t>static/ — the working review interface. evaluation/ and tests/ — reproducible synthetic comparisons and regression checks.</w:t>
+      </w:r>
+    </w:p>
+    <w:p>
+      <w:r>
+        <w:t>The diagram describes the current local application. Production identity, bank integrations and a WealthGPT retrieval layer are future work, not hidden dependencies.</w:t>
+      </w:r>
+    </w:p>
+    <w:p>
+      <w:r>
+        <w:br w:type="page"/>
+      </w:r>
+    </w:p>
+    <w:p>
+      <w:pPr>
+        <w:pStyle w:val="Heading1"/>
+      </w:pPr>
+      <w:r>
+        <w:t>Prototype evidence review</w:t>
+      </w:r>
+    </w:p>
+    <w:p>
+      <w:r>
+        <w:t>Actual desktop capture from the earlier working build. It illustrates source inspection, an attributed clarification and a zero-change duplicate preview. Current navigation additionally includes FD maturities and downloadable receipts.</w:t>
+      </w:r>
+    </w:p>
+    <w:p>
+      <w:r>
+        <w:drawing>
+          <wp:inline xmlns:a="http://schemas.openxmlformats.org/drawingml/2006/main" xmlns:pic="http://schemas.openxmlformats.org/drawingml/2006/picture">
+            <wp:extent cx="5394960" cy="7906988"/>
+            <wp:docPr id="2" name="Picture 2" descr="Actual NestProof evidence review with source references and duplicate confirmation preview"/>
+            <wp:cNvGraphicFramePr>
+              <a:graphicFrameLocks noChangeAspect="1"/>
+            </wp:cNvGraphicFramePr>
+            <a:graphic>
+              <a:graphicData uri="http://schemas.openxmlformats.org/drawingml/2006/picture">
+                <pic:pic>
+                  <pic:nvPicPr>
+                    <pic:cNvPr id="0" name="NESTPROOF_PREVIEW.jpg"/>
+                    <pic:cNvPicPr/>
+                  </pic:nvPicPr>
+                  <pic:blipFill>
+                    <a:blip r:embed="rId13"/>
+                    <a:stretch>
+                      <a:fillRect/>
+                    </a:stretch>
+                  </pic:blipFill>
+                  <pic:spPr>
+                    <a:xfrm>
+                      <a:off x="0" y="0"/>
+                      <a:ext cx="5394960" cy="7906988"/>
+                    </a:xfrm>
+                    <a:prstGeom prst="rect"/>
+                  </pic:spPr>
+                </pic:pic>
+              </a:graphicData>
+            </a:graphic>
+          </wp:inline>
+        </w:drawing>
+      </w:r>
+    </w:p>
     <w:sectPr>
       <w:pgSz w:w="11909" w:h="16834"/>
       <w:pgMar w:top="936" w:right="1080" w:bottom="936" w:left="1080" w:header="720" w:footer="720" w:gutter="0"/>

</xml_diff>

<commit_message>
Add isolated decision challenge and harden maturity reconciliation
</commit_message>
<xml_diff>
--- a/submission/NestProof_Track_C_Submission.docx
+++ b/submission/NestProof_Track_C_Submission.docx
@@ -12,7 +12,7 @@
     </w:p>
     <w:p>
       <w:r>
-        <w:t>Track C submission case study  |  WealthNest.AI  |  10 October 2026</w:t>
+        <w:t>Track C submission case study  |  WealthNest.AI  |  11 October 2026</w:t>
       </w:r>
     </w:p>
     <w:p>
@@ -263,7 +263,7 @@
                 <w:b w:val="0"/>
                 <w:sz w:val="18"/>
               </w:rPr>
-              <w:t>64 tests; 3 grouped browser checks passed</w:t>
+              <w:t>74 tests; 3 grouped browser checks passed</w:t>
             </w:r>
           </w:p>
         </w:tc>
@@ -619,7 +619,7 @@
     </w:p>
     <w:p>
       <w:r>
-        <w:t>The diagram describes the current local application. Production identity, bank integrations and a WealthGPT retrieval layer are future work, not hidden dependencies.</w:t>
+        <w:t>New decision challenge: change one interpreted field and rerun the same relation engine without changing evidence or the ledger. One-paisa conflicts and missing-reference review were verified live. Same-date maturity disagreements also require explicit review. This is pairwise sensitivity analysis, not an extraction benchmark.</w:t>
       </w:r>
     </w:p>
     <w:p>

</xml_diff>